<commit_message>
Update Help Documentation and TypeScript References
- Changed the import path in `next-env.d.ts` to point to the development types for routes, ensuring compatibility with the latest Next.js structure.
- Enhanced the README and various instruction files to clarify the process for resetting Help text in live deployments, emphasizing the importance of syncing with the database after markdown updates.
- Updated multiple instruction documents to include new sections on managing party accounts under **Sides**, improving clarity for both administrators and mediators regarding user management.

These changes improve the documentation and ensure that the development environment aligns with the latest updates, enhancing the overall user experience during mediation sessions.
</commit_message>
<xml_diff>
--- a/public/docs/en/admin.docx
+++ b/public/docs/en/admin.docx
@@ -107,7 +107,27 @@
           <w:sz w:val="22"/>
           <w:szCs w:val="22"/>
         </w:rPr>
-        <w:t xml:space="preserve"> The Help icon in the top bar opens all instructions (overview, parties, mediator, admin). The chat assistant replies in </w:t>
+        <w:t xml:space="preserve"> The </w:t>
+      </w:r>
+      <w:r>
+        <w:rPr>
+          <w:rFonts w:ascii="Calibri" w:cs="Calibri" w:eastAsia="Calibri" w:hAnsi="Calibri"/>
+          <w:b/>
+          <w:bCs/>
+          <w:color w:val="1A1A18"/>
+          <w:sz w:val="22"/>
+          <w:szCs w:val="22"/>
+        </w:rPr>
+        <w:t xml:space="preserve">Help</w:t>
+      </w:r>
+      <w:r>
+        <w:rPr>
+          <w:rFonts w:ascii="Calibri" w:cs="Calibri" w:eastAsia="Calibri" w:hAnsi="Calibri"/>
+          <w:color w:val="1A1A18"/>
+          <w:sz w:val="22"/>
+          <w:szCs w:val="22"/>
+        </w:rPr>
+        <w:t xml:space="preserve"> button at the bottom of the sidebar opens all instructions (overview, parties, mediator, admin). The chat assistant replies in </w:t>
       </w:r>
       <w:r>
         <w:rPr>
@@ -147,7 +167,27 @@
           <w:sz w:val="22"/>
           <w:szCs w:val="22"/>
         </w:rPr>
-        <w:t xml:space="preserve">.</w:t>
+        <w:t xml:space="preserve">. Ask the Help assistant about waits, </w:t>
+      </w:r>
+      <w:r>
+        <w:rPr>
+          <w:rFonts w:ascii="Calibri" w:cs="Calibri" w:eastAsia="Calibri" w:hAnsi="Calibri"/>
+          <w:b/>
+          <w:bCs/>
+          <w:color w:val="1A1A18"/>
+          <w:sz w:val="22"/>
+          <w:szCs w:val="22"/>
+        </w:rPr>
+        <w:t xml:space="preserve">Sides</w:t>
+      </w:r>
+      <w:r>
+        <w:rPr>
+          <w:rFonts w:ascii="Calibri" w:cs="Calibri" w:eastAsia="Calibri" w:hAnsi="Calibri"/>
+          <w:color w:val="1A1A18"/>
+          <w:sz w:val="22"/>
+          <w:szCs w:val="22"/>
+        </w:rPr>
+        <w:t xml:space="preserve">, schedule, or Mode A/B if you need a quick reminder from these texts.</w:t>
       </w:r>
     </w:p>
     <w:p>
@@ -306,7 +346,7 @@
           <w:sz w:val="22"/>
           <w:szCs w:val="22"/>
         </w:rPr>
-        <w:t xml:space="preserve">Room card</w:t>
+        <w:t xml:space="preserve">Sides</w:t>
       </w:r>
     </w:p>
     <w:p>
@@ -325,7 +365,7 @@
           <w:sz w:val="22"/>
           <w:szCs w:val="22"/>
         </w:rPr>
-        <w:t xml:space="preserve">Credentials and Magic Link</w:t>
+        <w:t xml:space="preserve">Room card</w:t>
       </w:r>
     </w:p>
     <w:p>
@@ -344,7 +384,7 @@
           <w:sz w:val="22"/>
           <w:szCs w:val="22"/>
         </w:rPr>
-        <w:t xml:space="preserve">Mediators</w:t>
+        <w:t xml:space="preserve">Credentials and Magic Link</w:t>
       </w:r>
     </w:p>
     <w:p>
@@ -363,7 +403,7 @@
           <w:sz w:val="22"/>
           <w:szCs w:val="22"/>
         </w:rPr>
-        <w:t xml:space="preserve">Settings: API credentials</w:t>
+        <w:t xml:space="preserve">Mediators</w:t>
       </w:r>
     </w:p>
     <w:p>
@@ -382,7 +422,7 @@
           <w:sz w:val="22"/>
           <w:szCs w:val="22"/>
         </w:rPr>
-        <w:t xml:space="preserve">Settings: tests</w:t>
+        <w:t xml:space="preserve">Settings: API credentials</w:t>
       </w:r>
     </w:p>
     <w:p>
@@ -401,7 +441,7 @@
           <w:sz w:val="22"/>
           <w:szCs w:val="22"/>
         </w:rPr>
-        <w:t xml:space="preserve">Settings: agent prompts</w:t>
+        <w:t xml:space="preserve">Settings: tests</w:t>
       </w:r>
     </w:p>
     <w:p>
@@ -420,7 +460,7 @@
           <w:sz w:val="22"/>
           <w:szCs w:val="22"/>
         </w:rPr>
-        <w:t xml:space="preserve">Settings: RAG</w:t>
+        <w:t xml:space="preserve">Settings: agent prompts</w:t>
       </w:r>
     </w:p>
     <w:p>
@@ -439,7 +479,7 @@
           <w:sz w:val="22"/>
           <w:szCs w:val="22"/>
         </w:rPr>
-        <w:t xml:space="preserve">Settings: Help</w:t>
+        <w:t xml:space="preserve">Settings: RAG</w:t>
       </w:r>
     </w:p>
     <w:p>
@@ -458,7 +498,7 @@
           <w:sz w:val="22"/>
           <w:szCs w:val="22"/>
         </w:rPr>
-        <w:t xml:space="preserve">Watching analysis and mediation</w:t>
+        <w:t xml:space="preserve">Settings: Help</w:t>
       </w:r>
     </w:p>
     <w:p>
@@ -477,7 +517,7 @@
           <w:sz w:val="22"/>
           <w:szCs w:val="22"/>
         </w:rPr>
-        <w:t xml:space="preserve">Language and logout</w:t>
+        <w:t xml:space="preserve">Watching analysis and mediation</w:t>
       </w:r>
     </w:p>
     <w:p>
@@ -496,6 +536,25 @@
           <w:sz w:val="22"/>
           <w:szCs w:val="22"/>
         </w:rPr>
+        <w:t xml:space="preserve">Language and logout</w:t>
+      </w:r>
+    </w:p>
+    <w:p>
+      <w:pPr>
+        <w:pStyle w:val="ListParagraph"/>
+        <w:numPr>
+          <w:ilvl w:val="0"/>
+          <w:numId w:val="2"/>
+        </w:numPr>
+        <w:spacing w:after="80"/>
+      </w:pPr>
+      <w:r>
+        <w:rPr>
+          <w:rFonts w:ascii="Calibri" w:cs="Calibri" w:eastAsia="Calibri" w:hAnsi="Calibri"/>
+          <w:color w:val="1A1A18"/>
+          <w:sz w:val="22"/>
+          <w:szCs w:val="22"/>
+        </w:rPr>
         <w:t xml:space="preserve">Tips and typical situations</w:t>
       </w:r>
     </w:p>
@@ -566,7 +625,27 @@
           <w:sz w:val="22"/>
           <w:szCs w:val="22"/>
         </w:rPr>
-        <w:t xml:space="preserve"> rooms (self-guided party mediation with AI);</w:t>
+        <w:t xml:space="preserve"> rooms (self-guided party mediation with AI) and attach new or </w:t>
+      </w:r>
+      <w:r>
+        <w:rPr>
+          <w:rFonts w:ascii="Calibri" w:cs="Calibri" w:eastAsia="Calibri" w:hAnsi="Calibri"/>
+          <w:b/>
+          <w:bCs/>
+          <w:color w:val="1A1A18"/>
+          <w:sz w:val="22"/>
+          <w:szCs w:val="22"/>
+        </w:rPr>
+        <w:t xml:space="preserve">existing</w:t>
+      </w:r>
+      <w:r>
+        <w:rPr>
+          <w:rFonts w:ascii="Calibri" w:cs="Calibri" w:eastAsia="Calibri" w:hAnsi="Calibri"/>
+          <w:color w:val="1A1A18"/>
+          <w:sz w:val="22"/>
+          <w:szCs w:val="22"/>
+        </w:rPr>
+        <w:t xml:space="preserve"> parties;</w:t>
       </w:r>
     </w:p>
     <w:p>
@@ -606,6 +685,65 @@
           <w:szCs w:val="22"/>
         </w:rPr>
         <w:t xml:space="preserve"> rooms: both yours (admin) and those created by mediators (Mode B);</w:t>
+      </w:r>
+    </w:p>
+    <w:p>
+      <w:pPr>
+        <w:pStyle w:val="ListParagraph"/>
+        <w:numPr>
+          <w:ilvl w:val="0"/>
+          <w:numId w:val="1"/>
+        </w:numPr>
+        <w:spacing w:after="80"/>
+      </w:pPr>
+      <w:r>
+        <w:rPr>
+          <w:rFonts w:ascii="Calibri" w:cs="Calibri" w:eastAsia="Calibri" w:hAnsi="Calibri"/>
+          <w:color w:val="1A1A18"/>
+          <w:sz w:val="22"/>
+          <w:szCs w:val="22"/>
+        </w:rPr>
+        <w:t xml:space="preserve">manage </w:t>
+      </w:r>
+      <w:r>
+        <w:rPr>
+          <w:rFonts w:ascii="Calibri" w:cs="Calibri" w:eastAsia="Calibri" w:hAnsi="Calibri"/>
+          <w:b/>
+          <w:bCs/>
+          <w:color w:val="1A1A18"/>
+          <w:sz w:val="22"/>
+          <w:szCs w:val="22"/>
+        </w:rPr>
+        <w:t xml:space="preserve">all</w:t>
+      </w:r>
+      <w:r>
+        <w:rPr>
+          <w:rFonts w:ascii="Calibri" w:cs="Calibri" w:eastAsia="Calibri" w:hAnsi="Calibri"/>
+          <w:color w:val="1A1A18"/>
+          <w:sz w:val="22"/>
+          <w:szCs w:val="22"/>
+        </w:rPr>
+        <w:t xml:space="preserve"> party accounts under </w:t>
+      </w:r>
+      <w:r>
+        <w:rPr>
+          <w:rFonts w:ascii="Calibri" w:cs="Calibri" w:eastAsia="Calibri" w:hAnsi="Calibri"/>
+          <w:b/>
+          <w:bCs/>
+          <w:color w:val="1A1A18"/>
+          <w:sz w:val="22"/>
+          <w:szCs w:val="22"/>
+        </w:rPr>
+        <w:t xml:space="preserve">Sides</w:t>
+      </w:r>
+      <w:r>
+        <w:rPr>
+          <w:rFonts w:ascii="Calibri" w:cs="Calibri" w:eastAsia="Calibri" w:hAnsi="Calibri"/>
+          <w:color w:val="1A1A18"/>
+          <w:sz w:val="22"/>
+          <w:szCs w:val="22"/>
+        </w:rPr>
+        <w:t xml:space="preserve"> (including roomless / orphan accounts);</w:t>
       </w:r>
     </w:p>
     <w:p>
@@ -1291,6 +1429,54 @@
                 <w:sz w:val="18"/>
                 <w:szCs w:val="18"/>
               </w:rPr>
+              <w:t xml:space="preserve">Sides</w:t>
+            </w:r>
+          </w:p>
+        </w:tc>
+        <w:tc>
+          <w:tcPr>
+            <w:tcW w:type="dxa" w:w="4500"/>
+            <w:tcBorders>
+              <w:top w:val="single" w:color="D8D4CC" w:sz="4"/>
+              <w:left w:val="single" w:color="D8D4CC" w:sz="4"/>
+              <w:bottom w:val="single" w:color="D8D4CC" w:sz="4"/>
+              <w:right w:val="single" w:color="D8D4CC" w:sz="4"/>
+            </w:tcBorders>
+          </w:tcPr>
+          <w:p>
+            <w:r>
+              <w:rPr>
+                <w:rFonts w:ascii="Calibri" w:cs="Calibri" w:eastAsia="Calibri" w:hAnsi="Calibri"/>
+                <w:color w:val="1A1A18"/>
+                <w:sz w:val="18"/>
+                <w:szCs w:val="18"/>
+              </w:rPr>
+              <w:t xml:space="preserve">All parties, including those without a room</w:t>
+            </w:r>
+          </w:p>
+        </w:tc>
+      </w:tr>
+      <w:tr>
+        <w:tc>
+          <w:tcPr>
+            <w:tcW w:type="dxa" w:w="4500"/>
+            <w:tcBorders>
+              <w:top w:val="single" w:color="D8D4CC" w:sz="4"/>
+              <w:left w:val="single" w:color="D8D4CC" w:sz="4"/>
+              <w:bottom w:val="single" w:color="D8D4CC" w:sz="4"/>
+              <w:right w:val="single" w:color="D8D4CC" w:sz="4"/>
+            </w:tcBorders>
+          </w:tcPr>
+          <w:p>
+            <w:r>
+              <w:rPr>
+                <w:rFonts w:ascii="Calibri" w:cs="Calibri" w:eastAsia="Calibri" w:hAnsi="Calibri"/>
+                <w:b/>
+                <w:bCs/>
+                <w:color w:val="1A1A18"/>
+                <w:sz w:val="18"/>
+                <w:szCs w:val="18"/>
+              </w:rPr>
               <w:t xml:space="preserve">Mediators</w:t>
             </w:r>
           </w:p>
@@ -1397,6 +1583,26 @@
           <w:sz w:val="22"/>
           <w:szCs w:val="22"/>
         </w:rPr>
+        <w:t xml:space="preserve">Help</w:t>
+      </w:r>
+      <w:r>
+        <w:rPr>
+          <w:rFonts w:ascii="Calibri" w:cs="Calibri" w:eastAsia="Calibri" w:hAnsi="Calibri"/>
+          <w:color w:val="1A1A18"/>
+          <w:sz w:val="22"/>
+          <w:szCs w:val="22"/>
+        </w:rPr>
+        <w:t xml:space="preserve">, </w:t>
+      </w:r>
+      <w:r>
+        <w:rPr>
+          <w:rFonts w:ascii="Calibri" w:cs="Calibri" w:eastAsia="Calibri" w:hAnsi="Calibri"/>
+          <w:b/>
+          <w:bCs/>
+          <w:color w:val="1A1A18"/>
+          <w:sz w:val="22"/>
+          <w:szCs w:val="22"/>
+        </w:rPr>
         <w:t xml:space="preserve">EN | UA</w:t>
       </w:r>
       <w:r>
@@ -1406,7 +1612,7 @@
           <w:sz w:val="22"/>
           <w:szCs w:val="22"/>
         </w:rPr>
-        <w:t xml:space="preserve"> and </w:t>
+        <w:t xml:space="preserve">, and </w:t>
       </w:r>
       <w:r>
         <w:rPr>
@@ -1480,7 +1686,7 @@
           <w:sz w:val="22"/>
           <w:szCs w:val="22"/>
         </w:rPr>
-        <w:t xml:space="preserve"> icon in the top bar opens the instructions and PDF / DOCX downloads. The notifications icon is decorative for now.</w:t>
+        <w:t xml:space="preserve"> button at the bottom of the sidebar opens the instructions and PDF / DOCX downloads. The notifications icon in the top bar is decorative for now.</w:t>
       </w:r>
     </w:p>
     <w:p>
@@ -2407,6 +2613,15 @@
       <w:r>
         <w:rPr>
           <w:rFonts w:ascii="Calibri" w:cs="Calibri" w:eastAsia="Calibri" w:hAnsi="Calibri"/>
+          <w:color w:val="1A1A18"/>
+          <w:sz w:val="22"/>
+          <w:szCs w:val="22"/>
+        </w:rPr>
+        <w:t xml:space="preserve">For </w:t>
+      </w:r>
+      <w:r>
+        <w:rPr>
+          <w:rFonts w:ascii="Calibri" w:cs="Calibri" w:eastAsia="Calibri" w:hAnsi="Calibri"/>
           <w:b/>
           <w:bCs/>
           <w:color w:val="1A1A18"/>
@@ -2442,7 +2657,37 @@
           <w:sz w:val="22"/>
           <w:szCs w:val="22"/>
         </w:rPr>
-        <w:t xml:space="preserve">: </w:t>
+        <w:t xml:space="preserve">, choose either:</w:t>
+      </w:r>
+    </w:p>
+    <w:p>
+      <w:pPr>
+        <w:pStyle w:val="ListParagraph"/>
+        <w:numPr>
+          <w:ilvl w:val="0"/>
+          <w:numId w:val="1"/>
+        </w:numPr>
+        <w:spacing w:after="80"/>
+      </w:pPr>
+      <w:r>
+        <w:rPr>
+          <w:rFonts w:ascii="Calibri" w:cs="Calibri" w:eastAsia="Calibri" w:hAnsi="Calibri"/>
+          <w:b/>
+          <w:bCs/>
+          <w:color w:val="1A1A18"/>
+          <w:sz w:val="22"/>
+          <w:szCs w:val="22"/>
+        </w:rPr>
+        <w:t xml:space="preserve">Create new</w:t>
+      </w:r>
+      <w:r>
+        <w:rPr>
+          <w:rFonts w:ascii="Calibri" w:cs="Calibri" w:eastAsia="Calibri" w:hAnsi="Calibri"/>
+          <w:color w:val="1A1A18"/>
+          <w:sz w:val="22"/>
+          <w:szCs w:val="22"/>
+        </w:rPr>
+        <w:t xml:space="preserve"> — </w:t>
       </w:r>
       <w:r>
         <w:rPr>
@@ -2482,7 +2727,37 @@
           <w:sz w:val="22"/>
           <w:szCs w:val="22"/>
         </w:rPr>
-        <w:t xml:space="preserve">.</w:t>
+        <w:t xml:space="preserve"> (new login psylex_… and password); or</w:t>
+      </w:r>
+    </w:p>
+    <w:p>
+      <w:pPr>
+        <w:pStyle w:val="ListParagraph"/>
+        <w:numPr>
+          <w:ilvl w:val="0"/>
+          <w:numId w:val="1"/>
+        </w:numPr>
+        <w:spacing w:after="80"/>
+      </w:pPr>
+      <w:r>
+        <w:rPr>
+          <w:rFonts w:ascii="Calibri" w:cs="Calibri" w:eastAsia="Calibri" w:hAnsi="Calibri"/>
+          <w:b/>
+          <w:bCs/>
+          <w:color w:val="1A1A18"/>
+          <w:sz w:val="22"/>
+          <w:szCs w:val="22"/>
+        </w:rPr>
+        <w:t xml:space="preserve">Add existing</w:t>
+      </w:r>
+      <w:r>
+        <w:rPr>
+          <w:rFonts w:ascii="Calibri" w:cs="Calibri" w:eastAsia="Calibri" w:hAnsi="Calibri"/>
+          <w:color w:val="1A1A18"/>
+          <w:sz w:val="22"/>
+          <w:szCs w:val="22"/>
+        </w:rPr>
+        <w:t xml:space="preserve"> — search by login or title and attach a returning participant (tests and personal bot stay; they only fill dispute intake for this room).</w:t>
       </w:r>
     </w:p>
     <w:p>
@@ -2526,7 +2801,7 @@
           <w:sz w:val="22"/>
           <w:szCs w:val="22"/>
         </w:rPr>
-        <w:t xml:space="preserve">Jurisdiction is fixed permanently: legal RAG search during analysis depends on it. You cannot change it later.</w:t>
+        <w:t xml:space="preserve">Jurisdiction is fixed permanently: legal RAG search during analysis depends on it. You cannot change it later. The same person cannot fill both party slots in one room.</w:t>
       </w:r>
     </w:p>
     <w:p>
@@ -2559,7 +2834,7 @@
           <w:sz w:val="22"/>
           <w:szCs w:val="22"/>
         </w:rPr>
-        <w:t xml:space="preserve">two users party_a and party_b appear with logins psylex_… and generated passwords;</w:t>
+        <w:t xml:space="preserve">party slots are filled with new or attached users (party_a / party_b);</w:t>
       </w:r>
     </w:p>
     <w:p>
@@ -2622,6 +2897,71 @@
     </w:p>
     <w:p>
       <w:pPr>
+        <w:spacing w:after="160" w:line="276"/>
+      </w:pPr>
+      <w:r>
+        <w:rPr>
+          <w:rFonts w:ascii="Calibri" w:cs="Calibri" w:eastAsia="Calibri" w:hAnsi="Calibri"/>
+          <w:b/>
+          <w:bCs/>
+          <w:color w:val="1A1A18"/>
+          <w:sz w:val="22"/>
+          <w:szCs w:val="22"/>
+        </w:rPr>
+        <w:t xml:space="preserve">Mode A vs Mode B:</w:t>
+      </w:r>
+      <w:r>
+        <w:rPr>
+          <w:rFonts w:ascii="Calibri" w:cs="Calibri" w:eastAsia="Calibri" w:hAnsi="Calibri"/>
+          <w:color w:val="1A1A18"/>
+          <w:sz w:val="22"/>
+          <w:szCs w:val="22"/>
+        </w:rPr>
+        <w:t xml:space="preserve"> admin </w:t>
+      </w:r>
+      <w:r>
+        <w:rPr>
+          <w:rFonts w:ascii="Calibri" w:cs="Calibri" w:eastAsia="Calibri" w:hAnsi="Calibri"/>
+          <w:b/>
+          <w:bCs/>
+          <w:color w:val="1A1A18"/>
+          <w:sz w:val="22"/>
+          <w:szCs w:val="22"/>
+        </w:rPr>
+        <w:t xml:space="preserve">New Room</w:t>
+      </w:r>
+      <w:r>
+        <w:rPr>
+          <w:rFonts w:ascii="Calibri" w:cs="Calibri" w:eastAsia="Calibri" w:hAnsi="Calibri"/>
+          <w:color w:val="1A1A18"/>
+          <w:sz w:val="22"/>
+          <w:szCs w:val="22"/>
+        </w:rPr>
+        <w:t xml:space="preserve"> is always Mode A. Mode B rooms are created by mediators and appear under </w:t>
+      </w:r>
+      <w:r>
+        <w:rPr>
+          <w:rFonts w:ascii="Calibri" w:cs="Calibri" w:eastAsia="Calibri" w:hAnsi="Calibri"/>
+          <w:b/>
+          <w:bCs/>
+          <w:color w:val="1A1A18"/>
+          <w:sz w:val="22"/>
+          <w:szCs w:val="22"/>
+        </w:rPr>
+        <w:t xml:space="preserve">Mediator rooms</w:t>
+      </w:r>
+      <w:r>
+        <w:rPr>
+          <w:rFonts w:ascii="Calibri" w:cs="Calibri" w:eastAsia="Calibri" w:hAnsi="Calibri"/>
+          <w:color w:val="1A1A18"/>
+          <w:sz w:val="22"/>
+          <w:szCs w:val="22"/>
+        </w:rPr>
+        <w:t xml:space="preserve">.</w:t>
+      </w:r>
+    </w:p>
+    <w:p>
+      <w:pPr>
         <w:pBdr>
           <w:bottom w:val="single" w:color="D8D4CC" w:sz="6" w:space="1"/>
         </w:pBdr>
@@ -2648,7 +2988,189 @@
           <w:sz w:val="28"/>
           <w:szCs w:val="28"/>
         </w:rPr>
-        <w:t xml:space="preserve">6. Room card</w:t>
+        <w:t xml:space="preserve">6. Sides</w:t>
+      </w:r>
+    </w:p>
+    <w:p>
+      <w:pPr>
+        <w:spacing w:after="160" w:line="276"/>
+      </w:pPr>
+      <w:r>
+        <w:rPr>
+          <w:rFonts w:ascii="Calibri" w:cs="Calibri" w:eastAsia="Calibri" w:hAnsi="Calibri"/>
+          <w:color w:val="1A1A18"/>
+          <w:sz w:val="22"/>
+          <w:szCs w:val="22"/>
+        </w:rPr>
+        <w:t xml:space="preserve">Menu item </w:t>
+      </w:r>
+      <w:r>
+        <w:rPr>
+          <w:rFonts w:ascii="Calibri" w:cs="Calibri" w:eastAsia="Calibri" w:hAnsi="Calibri"/>
+          <w:b/>
+          <w:bCs/>
+          <w:color w:val="1A1A18"/>
+          <w:sz w:val="22"/>
+          <w:szCs w:val="22"/>
+        </w:rPr>
+        <w:t xml:space="preserve">Sides</w:t>
+      </w:r>
+      <w:r>
+        <w:rPr>
+          <w:rFonts w:ascii="Calibri" w:cs="Calibri" w:eastAsia="Calibri" w:hAnsi="Calibri"/>
+          <w:color w:val="1A1A18"/>
+          <w:sz w:val="22"/>
+          <w:szCs w:val="22"/>
+        </w:rPr>
+        <w:t xml:space="preserve"> — the full party registry.</w:t>
+      </w:r>
+    </w:p>
+    <w:p>
+      <w:pPr>
+        <w:pStyle w:val="ListParagraph"/>
+        <w:numPr>
+          <w:ilvl w:val="0"/>
+          <w:numId w:val="1"/>
+        </w:numPr>
+        <w:spacing w:after="80"/>
+      </w:pPr>
+      <w:r>
+        <w:rPr>
+          <w:rFonts w:ascii="Calibri" w:cs="Calibri" w:eastAsia="Calibri" w:hAnsi="Calibri"/>
+          <w:color w:val="1A1A18"/>
+          <w:sz w:val="22"/>
+          <w:szCs w:val="22"/>
+        </w:rPr>
+        <w:t xml:space="preserve">Admins see </w:t>
+      </w:r>
+      <w:r>
+        <w:rPr>
+          <w:rFonts w:ascii="Calibri" w:cs="Calibri" w:eastAsia="Calibri" w:hAnsi="Calibri"/>
+          <w:b/>
+          <w:bCs/>
+          <w:color w:val="1A1A18"/>
+          <w:sz w:val="22"/>
+          <w:szCs w:val="22"/>
+        </w:rPr>
+        <w:t xml:space="preserve">all</w:t>
+      </w:r>
+      <w:r>
+        <w:rPr>
+          <w:rFonts w:ascii="Calibri" w:cs="Calibri" w:eastAsia="Calibri" w:hAnsi="Calibri"/>
+          <w:color w:val="1A1A18"/>
+          <w:sz w:val="22"/>
+          <w:szCs w:val="22"/>
+        </w:rPr>
+        <w:t xml:space="preserve"> parties, including those with </w:t>
+      </w:r>
+      <w:r>
+        <w:rPr>
+          <w:rFonts w:ascii="Calibri" w:cs="Calibri" w:eastAsia="Calibri" w:hAnsi="Calibri"/>
+          <w:b/>
+          <w:bCs/>
+          <w:color w:val="1A1A18"/>
+          <w:sz w:val="22"/>
+          <w:szCs w:val="22"/>
+        </w:rPr>
+        <w:t xml:space="preserve">no room</w:t>
+      </w:r>
+      <w:r>
+        <w:rPr>
+          <w:rFonts w:ascii="Calibri" w:cs="Calibri" w:eastAsia="Calibri" w:hAnsi="Calibri"/>
+          <w:color w:val="1A1A18"/>
+          <w:sz w:val="22"/>
+          <w:szCs w:val="22"/>
+        </w:rPr>
+        <w:t xml:space="preserve"> (roomless / orphan accounts).</w:t>
+      </w:r>
+    </w:p>
+    <w:p>
+      <w:pPr>
+        <w:pStyle w:val="ListParagraph"/>
+        <w:numPr>
+          <w:ilvl w:val="0"/>
+          <w:numId w:val="1"/>
+        </w:numPr>
+        <w:spacing w:after="80"/>
+      </w:pPr>
+      <w:r>
+        <w:rPr>
+          <w:rFonts w:ascii="Calibri" w:cs="Calibri" w:eastAsia="Calibri" w:hAnsi="Calibri"/>
+          <w:color w:val="1A1A18"/>
+          <w:sz w:val="22"/>
+          <w:szCs w:val="22"/>
+        </w:rPr>
+        <w:t xml:space="preserve">Mediators see only parties from their own rooms (see mediator.md).</w:t>
+      </w:r>
+    </w:p>
+    <w:p>
+      <w:pPr>
+        <w:pStyle w:val="ListParagraph"/>
+        <w:numPr>
+          <w:ilvl w:val="0"/>
+          <w:numId w:val="1"/>
+        </w:numPr>
+        <w:spacing w:after="80"/>
+      </w:pPr>
+      <w:r>
+        <w:rPr>
+          <w:rFonts w:ascii="Calibri" w:cs="Calibri" w:eastAsia="Calibri" w:hAnsi="Calibri"/>
+          <w:color w:val="1A1A18"/>
+          <w:sz w:val="22"/>
+          <w:szCs w:val="22"/>
+        </w:rPr>
+        <w:t xml:space="preserve">Use </w:t>
+      </w:r>
+      <w:r>
+        <w:rPr>
+          <w:rFonts w:ascii="Calibri" w:cs="Calibri" w:eastAsia="Calibri" w:hAnsi="Calibri"/>
+          <w:b/>
+          <w:bCs/>
+          <w:color w:val="1A1A18"/>
+          <w:sz w:val="22"/>
+          <w:szCs w:val="22"/>
+        </w:rPr>
+        <w:t xml:space="preserve">Sides</w:t>
+      </w:r>
+      <w:r>
+        <w:rPr>
+          <w:rFonts w:ascii="Calibri" w:cs="Calibri" w:eastAsia="Calibri" w:hAnsi="Calibri"/>
+          <w:color w:val="1A1A18"/>
+          <w:sz w:val="22"/>
+          <w:szCs w:val="22"/>
+        </w:rPr>
+        <w:t xml:space="preserve"> to open a party card, copy credentials, or find accounts to attach when creating a room.</w:t>
+      </w:r>
+    </w:p>
+    <w:p>
+      <w:pPr>
+        <w:pBdr>
+          <w:bottom w:val="single" w:color="D8D4CC" w:sz="6" w:space="1"/>
+        </w:pBdr>
+        <w:spacing w:after="120" w:before="120"/>
+      </w:pPr>
+      <w:r>
+        <w:t xml:space="preserve"/>
+      </w:r>
+    </w:p>
+    <w:p>
+      <w:pPr>
+        <w:pStyle w:val="Heading2"/>
+        <w:pBdr>
+          <w:bottom w:val="single" w:color="9A7B2F" w:sz="8" w:space="4"/>
+        </w:pBdr>
+        <w:spacing w:after="120" w:before="280"/>
+      </w:pPr>
+      <w:r>
+        <w:rPr>
+          <w:rFonts w:ascii="Georgia" w:cs="Georgia" w:eastAsia="Georgia" w:hAnsi="Georgia"/>
+          <w:b/>
+          <w:bCs/>
+          <w:color w:val="1A1A18"/>
+          <w:sz w:val="28"/>
+          <w:szCs w:val="28"/>
+        </w:rPr>
+        <w:t xml:space="preserve">7. Room card</w:t>
       </w:r>
     </w:p>
     <w:p>
@@ -3217,7 +3739,7 @@
           <w:sz w:val="28"/>
           <w:szCs w:val="28"/>
         </w:rPr>
-        <w:t xml:space="preserve">7. Credentials and Magic Link</w:t>
+        <w:t xml:space="preserve">8. Credentials and Magic Link</w:t>
       </w:r>
     </w:p>
     <w:p>
@@ -3422,7 +3944,27 @@
           <w:sz w:val="22"/>
           <w:szCs w:val="22"/>
         </w:rPr>
-        <w:t xml:space="preserve">after sign-in it becomes used;</w:t>
+        <w:t xml:space="preserve">the recipient opens a confirmation page and clicks </w:t>
+      </w:r>
+      <w:r>
+        <w:rPr>
+          <w:rFonts w:ascii="Calibri" w:cs="Calibri" w:eastAsia="Calibri" w:hAnsi="Calibri"/>
+          <w:b/>
+          <w:bCs/>
+          <w:color w:val="1A1A18"/>
+          <w:sz w:val="22"/>
+          <w:szCs w:val="22"/>
+        </w:rPr>
+        <w:t xml:space="preserve">Continue</w:t>
+      </w:r>
+      <w:r>
+        <w:rPr>
+          <w:rFonts w:ascii="Calibri" w:cs="Calibri" w:eastAsia="Calibri" w:hAnsi="Calibri"/>
+          <w:color w:val="1A1A18"/>
+          <w:sz w:val="22"/>
+          <w:szCs w:val="22"/>
+        </w:rPr>
+        <w:t xml:space="preserve"> to complete sign-in (the link is consumed then);</w:t>
       </w:r>
     </w:p>
     <w:p>
@@ -3441,7 +3983,26 @@
           <w:sz w:val="22"/>
           <w:szCs w:val="22"/>
         </w:rPr>
-        <w:t xml:space="preserve">the user lands immediately on their next step (onboarding, lobby, and so on).</w:t>
+        <w:t xml:space="preserve">after use it becomes invalid;</w:t>
+      </w:r>
+    </w:p>
+    <w:p>
+      <w:pPr>
+        <w:pStyle w:val="ListParagraph"/>
+        <w:numPr>
+          <w:ilvl w:val="0"/>
+          <w:numId w:val="1"/>
+        </w:numPr>
+        <w:spacing w:after="80"/>
+      </w:pPr>
+      <w:r>
+        <w:rPr>
+          <w:rFonts w:ascii="Calibri" w:cs="Calibri" w:eastAsia="Calibri" w:hAnsi="Calibri"/>
+          <w:color w:val="1A1A18"/>
+          <w:sz w:val="22"/>
+          <w:szCs w:val="22"/>
+        </w:rPr>
+        <w:t xml:space="preserve">the user lands on their next step (onboarding, lobby, and so on).</w:t>
       </w:r>
     </w:p>
     <w:p>
@@ -3560,7 +4121,7 @@
           <w:sz w:val="28"/>
           <w:szCs w:val="28"/>
         </w:rPr>
-        <w:t xml:space="preserve">8. Mediators</w:t>
+        <w:t xml:space="preserve">9. Mediators</w:t>
       </w:r>
     </w:p>
     <w:p>
@@ -4135,7 +4696,7 @@
           <w:sz w:val="28"/>
           <w:szCs w:val="28"/>
         </w:rPr>
-        <w:t xml:space="preserve">9. Settings: API credentials</w:t>
+        <w:t xml:space="preserve">10. Settings: API credentials</w:t>
       </w:r>
     </w:p>
     <w:p>
@@ -4393,7 +4954,7 @@
           <w:sz w:val="28"/>
           <w:szCs w:val="28"/>
         </w:rPr>
-        <w:t xml:space="preserve">10. Settings: tests</w:t>
+        <w:t xml:space="preserve">11. Settings: tests</w:t>
       </w:r>
     </w:p>
     <w:p>
@@ -4817,7 +5378,7 @@
           <w:sz w:val="28"/>
           <w:szCs w:val="28"/>
         </w:rPr>
-        <w:t xml:space="preserve">11. Settings: agent prompts</w:t>
+        <w:t xml:space="preserve">12. Settings: agent prompts</w:t>
       </w:r>
     </w:p>
     <w:p>
@@ -5590,7 +6151,7 @@
           <w:sz w:val="28"/>
           <w:szCs w:val="28"/>
         </w:rPr>
-        <w:t xml:space="preserve">12. Settings: RAG</w:t>
+        <w:t xml:space="preserve">13. Settings: RAG</w:t>
       </w:r>
     </w:p>
     <w:p>
@@ -6359,7 +6920,7 @@
           <w:sz w:val="28"/>
           <w:szCs w:val="28"/>
         </w:rPr>
-        <w:t xml:space="preserve">13. Settings: Help</w:t>
+        <w:t xml:space="preserve">14. Settings: Help</w:t>
       </w:r>
     </w:p>
     <w:p>
@@ -6606,7 +7167,26 @@
           <w:sz w:val="22"/>
           <w:szCs w:val="22"/>
         </w:rPr>
-        <w:t xml:space="preserve"> — restore the text from the instruction/ repository.</w:t>
+        <w:t xml:space="preserve"> — restore the text from the instruction/ repository (use this after a deploy if the live DB still has an older edited copy).</w:t>
+      </w:r>
+    </w:p>
+    <w:p>
+      <w:pPr>
+        <w:pStyle w:val="ListParagraph"/>
+        <w:numPr>
+          <w:ilvl w:val="0"/>
+          <w:numId w:val="2"/>
+        </w:numPr>
+        <w:spacing w:after="80"/>
+      </w:pPr>
+      <w:r>
+        <w:rPr>
+          <w:rFonts w:ascii="Calibri" w:cs="Calibri" w:eastAsia="Calibri" w:hAnsi="Calibri"/>
+          <w:color w:val="1A1A18"/>
+          <w:sz w:val="22"/>
+          <w:szCs w:val="22"/>
+        </w:rPr>
+        <w:t xml:space="preserve">Regenerating PDF / DOCX exports for Help is done from the repository (npm run help:docs); after deploy, reset live overrides if admins had edited copies so production matches git.</w:t>
       </w:r>
     </w:p>
     <w:p>
@@ -6687,7 +7267,7 @@
           <w:sz w:val="28"/>
           <w:szCs w:val="28"/>
         </w:rPr>
-        <w:t xml:space="preserve">14. Watching analysis and mediation</w:t>
+        <w:t xml:space="preserve">15. Watching analysis and mediation</w:t>
       </w:r>
     </w:p>
     <w:p>
@@ -6786,7 +7366,27 @@
           <w:sz w:val="22"/>
           <w:szCs w:val="22"/>
         </w:rPr>
-        <w:t xml:space="preserve">Pipeline: triggered / completed, agent started / completed / failed / skipped, mediation phase changed.</w:t>
+        <w:t xml:space="preserve">Pipeline: triggered / completed, agent started / completed / failed / skipped, mediation phase changed. Incomplete readiness steps may show </w:t>
+      </w:r>
+      <w:r>
+        <w:rPr>
+          <w:rFonts w:ascii="Calibri" w:cs="Calibri" w:eastAsia="Calibri" w:hAnsi="Calibri"/>
+          <w:b/>
+          <w:bCs/>
+          <w:color w:val="1A1A18"/>
+          <w:sz w:val="22"/>
+          <w:szCs w:val="22"/>
+        </w:rPr>
+        <w:t xml:space="preserve">Generating…</w:t>
+      </w:r>
+      <w:r>
+        <w:rPr>
+          <w:rFonts w:ascii="Calibri" w:cs="Calibri" w:eastAsia="Calibri" w:hAnsi="Calibri"/>
+          <w:color w:val="1A1A18"/>
+          <w:sz w:val="22"/>
+          <w:szCs w:val="22"/>
+        </w:rPr>
+        <w:t xml:space="preserve"> while AI analysis runs.</w:t>
       </w:r>
     </w:p>
     <w:p>
@@ -7148,7 +7748,27 @@
           <w:sz w:val="22"/>
           <w:szCs w:val="22"/>
         </w:rPr>
-        <w:t xml:space="preserve">The admin </w:t>
+        <w:t xml:space="preserve">The downloadable results PDF covers legislation / legal information, the agreed solution (or no-agreement note), and the agreement text — </w:t>
+      </w:r>
+      <w:r>
+        <w:rPr>
+          <w:rFonts w:ascii="Calibri" w:cs="Calibri" w:eastAsia="Calibri" w:hAnsi="Calibri"/>
+          <w:b/>
+          <w:bCs/>
+          <w:color w:val="1A1A18"/>
+          <w:sz w:val="22"/>
+          <w:szCs w:val="22"/>
+        </w:rPr>
+        <w:t xml:space="preserve">without</w:t>
+      </w:r>
+      <w:r>
+        <w:rPr>
+          <w:rFonts w:ascii="Calibri" w:cs="Calibri" w:eastAsia="Calibri" w:hAnsi="Calibri"/>
+          <w:color w:val="1A1A18"/>
+          <w:sz w:val="22"/>
+          <w:szCs w:val="22"/>
+        </w:rPr>
+        <w:t xml:space="preserve"> a psychodynamic profile chapter. The admin </w:t>
       </w:r>
       <w:r>
         <w:rPr>
@@ -7199,7 +7819,7 @@
           <w:sz w:val="28"/>
           <w:szCs w:val="28"/>
         </w:rPr>
-        <w:t xml:space="preserve">15. Language and logout</w:t>
+        <w:t xml:space="preserve">16. Language and logout</w:t>
       </w:r>
     </w:p>
     <w:p>
@@ -7290,7 +7910,7 @@
           <w:sz w:val="28"/>
           <w:szCs w:val="28"/>
         </w:rPr>
-        <w:t xml:space="preserve">16. Tips and typical situations</w:t>
+        <w:t xml:space="preserve">17. Tips and typical situations</w:t>
       </w:r>
     </w:p>
     <w:p>
@@ -7335,7 +7955,27 @@
           <w:sz w:val="22"/>
           <w:szCs w:val="22"/>
         </w:rPr>
-        <w:t xml:space="preserve"> is always Mode A. Mode B appears when a mediator creates the room. Both types are visible on the matching tabs.</w:t>
+        <w:t xml:space="preserve"> is always Mode A. Mode B appears when a mediator creates the room. Both types are visible on the matching tabs. Create-room can attach existing parties from </w:t>
+      </w:r>
+      <w:r>
+        <w:rPr>
+          <w:rFonts w:ascii="Calibri" w:cs="Calibri" w:eastAsia="Calibri" w:hAnsi="Calibri"/>
+          <w:b/>
+          <w:bCs/>
+          <w:color w:val="1A1A18"/>
+          <w:sz w:val="22"/>
+          <w:szCs w:val="22"/>
+        </w:rPr>
+        <w:t xml:space="preserve">Sides</w:t>
+      </w:r>
+      <w:r>
+        <w:rPr>
+          <w:rFonts w:ascii="Calibri" w:cs="Calibri" w:eastAsia="Calibri" w:hAnsi="Calibri"/>
+          <w:color w:val="1A1A18"/>
+          <w:sz w:val="22"/>
+          <w:szCs w:val="22"/>
+        </w:rPr>
+        <w:t xml:space="preserve">.</w:t>
       </w:r>
     </w:p>
     <w:p>

</xml_diff>